<commit_message>
Crear documentos complementarios finales
</commit_message>
<xml_diff>
--- a/documentacion/entregables/Politica_Uso_Contrasenas.docx
+++ b/documentacion/entregables/Politica_Uso_Contrasenas.docx
@@ -28,7 +28,7 @@
           <w:b/>
           <w:sz w:val="32"/>
         </w:rPr>
-        <w:t>Política de Uso de Contraseñas</w:t>
+        <w:t>Política de uso de contraseñas</w:t>
       </w:r>
     </w:p>
     <w:p>
@@ -148,7 +148,7 @@
         <w:pStyle w:val="Heading1"/>
       </w:pPr>
       <w:r>
-        <w:t>Objetivo</w:t>
+        <w:t>1. Propósito</w:t>
       </w:r>
     </w:p>
     <w:p>
@@ -160,7 +160,7 @@
           <w:rFonts w:ascii="Times New Roman" w:hAnsi="Times New Roman"/>
           <w:sz w:val="24"/>
         </w:rPr>
-        <w:t>Establecer reglas y controles para la creacion, uso, almacenamiento, recuperacion y administracion de contraseñas en el sistema web de ventas y en el servidor Fedora 39.</w:t>
+        <w:t>Esta política define las reglas mínimas para crear, usar, proteger, recuperar y administrar contraseñas en el sistema web de ventas y en el servidor Fedora 39 utilizado para la auditoría. Su objetivo es reducir accesos no autorizados y evitar que una contraseña débil comprometa el sistema completo.</w:t>
       </w:r>
     </w:p>
     <w:p>
@@ -168,7 +168,7 @@
         <w:pStyle w:val="Heading1"/>
       </w:pPr>
       <w:r>
-        <w:t>Alcance</w:t>
+        <w:t>2. Alcance</w:t>
       </w:r>
     </w:p>
     <w:p>
@@ -180,7 +180,7 @@
           <w:rFonts w:ascii="Times New Roman" w:hAnsi="Times New Roman"/>
           <w:sz w:val="24"/>
         </w:rPr>
-        <w:t>Esta política aplica a usuarios del sistema de ventas, administradores del servidor, desarrolladores y cualquier integrante que tenga acceso al repositorio, la aplicación o la máquina virtual utilizada durante la auditoría.</w:t>
+        <w:t>La política aplica a los usuarios del sistema de ventas, al administrador del servidor Fedora, al equipo de desarrollo y a cualquier persona que tenga acceso al repositorio, a la base de datos, a la máquina virtual o al entorno de demostración.</w:t>
       </w:r>
     </w:p>
     <w:p>
@@ -188,7 +188,7 @@
         <w:pStyle w:val="Heading1"/>
       </w:pPr>
       <w:r>
-        <w:t>Responsables</w:t>
+        <w:t>3. Principios de la política</w:t>
       </w:r>
     </w:p>
     <w:p>
@@ -200,7 +200,7 @@
           <w:rFonts w:ascii="Times New Roman" w:hAnsi="Times New Roman"/>
           <w:sz w:val="24"/>
         </w:rPr>
-        <w:t>Administrador del sistema: crear usuarios, revocar accesos y controlar privilegios.</w:t>
+        <w:t>Cada usuario debe tener una cuenta individual. No se recomienda compartir usuarios genéricos salvo en demostraciones controladas.</w:t>
       </w:r>
     </w:p>
     <w:p>
@@ -212,7 +212,7 @@
           <w:rFonts w:ascii="Times New Roman" w:hAnsi="Times New Roman"/>
           <w:sz w:val="24"/>
         </w:rPr>
-        <w:t>Desarrollador: implementar válidaciónes, hash de contraseñas y controles de autenticación.</w:t>
+        <w:t>La contraseña debe proteger el acceso al sistema y no debe escribirse en documentos, chats o capturas destinadas a publicación.</w:t>
       </w:r>
     </w:p>
     <w:p>
@@ -224,7 +224,7 @@
           <w:rFonts w:ascii="Times New Roman" w:hAnsi="Times New Roman"/>
           <w:sz w:val="24"/>
         </w:rPr>
-        <w:t>Usuarios: proteger sus credenciales y reportar accesos sospechosos.</w:t>
+        <w:t>Las credenciales usadas para la práctica, como admin/admin123, existen solo para demostrar una falla prediseñada y no deben utilizarse en producción.</w:t>
       </w:r>
     </w:p>
     <w:p>
@@ -236,7 +236,7 @@
           <w:rFonts w:ascii="Times New Roman" w:hAnsi="Times New Roman"/>
           <w:sz w:val="24"/>
         </w:rPr>
-        <w:t>Equipo auditor: verificar el cumplimiento de la política durante las pruebas.</w:t>
+        <w:t>El almacenamiento seguro de contraseñas es responsabilidad del sistema; el usuario no debería depender únicamente de su memoria o cuidado personal.</w:t>
       </w:r>
     </w:p>
     <w:p>
@@ -244,7 +244,890 @@
         <w:pStyle w:val="Heading1"/>
       </w:pPr>
       <w:r>
-        <w:t>Reglas para contraseñas</w:t>
+        <w:t>4. Reglas para creación de contraseñas</w:t>
+      </w:r>
+    </w:p>
+    <w:tbl>
+      <w:tblPr>
+        <w:tblStyle w:val="TableGrid"/>
+        <w:tblW w:type="auto" w:w="0"/>
+        <w:jc w:val="center"/>
+        <w:tblLook w:firstColumn="1" w:firstRow="1" w:lastColumn="0" w:lastRow="0" w:noHBand="0" w:noVBand="1" w:val="04A0"/>
+      </w:tblPr>
+      <w:tblGrid>
+        <w:gridCol w:w="3120"/>
+        <w:gridCol w:w="3120"/>
+        <w:gridCol w:w="3120"/>
+      </w:tblGrid>
+      <w:tr>
+        <w:trPr>
+          <w:tblHeader w:val="true"/>
+        </w:trPr>
+        <w:tc>
+          <w:tcPr>
+            <w:tcW w:type="dxa" w:w="3120"/>
+            <w:vAlign w:val="center"/>
+            <w:shd w:fill="E8EEF5"/>
+          </w:tcPr>
+          <w:p>
+            <w:pPr>
+              <w:jc w:val="left"/>
+            </w:pPr>
+            <w:r>
+              <w:rPr>
+                <w:rFonts w:ascii="Times New Roman" w:hAnsi="Times New Roman"/>
+                <w:b/>
+                <w:sz w:val="18"/>
+              </w:rPr>
+            </w:r>
+            <w:r>
+              <w:rPr>
+                <w:rFonts w:ascii="Times New Roman" w:hAnsi="Times New Roman"/>
+                <w:b/>
+                <w:sz w:val="18"/>
+              </w:rPr>
+              <w:t>Regla</w:t>
+            </w:r>
+          </w:p>
+        </w:tc>
+        <w:tc>
+          <w:tcPr>
+            <w:tcW w:type="dxa" w:w="3120"/>
+            <w:vAlign w:val="center"/>
+            <w:shd w:fill="E8EEF5"/>
+          </w:tcPr>
+          <w:p>
+            <w:pPr>
+              <w:jc w:val="left"/>
+            </w:pPr>
+            <w:r>
+              <w:rPr>
+                <w:rFonts w:ascii="Times New Roman" w:hAnsi="Times New Roman"/>
+                <w:b/>
+                <w:sz w:val="18"/>
+              </w:rPr>
+            </w:r>
+            <w:r>
+              <w:rPr>
+                <w:rFonts w:ascii="Times New Roman" w:hAnsi="Times New Roman"/>
+                <w:b/>
+                <w:sz w:val="18"/>
+              </w:rPr>
+              <w:t>Requisito</w:t>
+            </w:r>
+          </w:p>
+        </w:tc>
+        <w:tc>
+          <w:tcPr>
+            <w:tcW w:type="dxa" w:w="3120"/>
+            <w:vAlign w:val="center"/>
+            <w:shd w:fill="E8EEF5"/>
+          </w:tcPr>
+          <w:p>
+            <w:pPr>
+              <w:jc w:val="left"/>
+            </w:pPr>
+            <w:r>
+              <w:rPr>
+                <w:rFonts w:ascii="Times New Roman" w:hAnsi="Times New Roman"/>
+                <w:b/>
+                <w:sz w:val="18"/>
+              </w:rPr>
+            </w:r>
+            <w:r>
+              <w:rPr>
+                <w:rFonts w:ascii="Times New Roman" w:hAnsi="Times New Roman"/>
+                <w:b/>
+                <w:sz w:val="18"/>
+              </w:rPr>
+              <w:t>Motivo</w:t>
+            </w:r>
+          </w:p>
+        </w:tc>
+      </w:tr>
+      <w:tr>
+        <w:tc>
+          <w:tcPr>
+            <w:tcW w:type="dxa" w:w="3120"/>
+            <w:vAlign w:val="center"/>
+          </w:tcPr>
+          <w:p>
+            <w:pPr>
+              <w:jc w:val="left"/>
+            </w:pPr>
+            <w:r>
+              <w:rPr>
+                <w:rFonts w:ascii="Times New Roman" w:hAnsi="Times New Roman"/>
+                <w:sz w:val="18"/>
+              </w:rPr>
+            </w:r>
+            <w:r>
+              <w:rPr>
+                <w:rFonts w:ascii="Times New Roman" w:hAnsi="Times New Roman"/>
+                <w:b w:val="0"/>
+                <w:sz w:val="18"/>
+              </w:rPr>
+              <w:t>Longitud</w:t>
+            </w:r>
+          </w:p>
+        </w:tc>
+        <w:tc>
+          <w:tcPr>
+            <w:tcW w:type="dxa" w:w="3120"/>
+            <w:vAlign w:val="center"/>
+          </w:tcPr>
+          <w:p>
+            <w:pPr>
+              <w:jc w:val="left"/>
+            </w:pPr>
+            <w:r>
+              <w:rPr>
+                <w:rFonts w:ascii="Times New Roman" w:hAnsi="Times New Roman"/>
+                <w:sz w:val="18"/>
+              </w:rPr>
+            </w:r>
+            <w:r>
+              <w:rPr>
+                <w:rFonts w:ascii="Times New Roman" w:hAnsi="Times New Roman"/>
+                <w:b w:val="0"/>
+                <w:sz w:val="18"/>
+              </w:rPr>
+              <w:t>Mínimo 10 caracteres</w:t>
+            </w:r>
+          </w:p>
+        </w:tc>
+        <w:tc>
+          <w:tcPr>
+            <w:tcW w:type="dxa" w:w="3120"/>
+            <w:vAlign w:val="center"/>
+          </w:tcPr>
+          <w:p>
+            <w:pPr>
+              <w:jc w:val="left"/>
+            </w:pPr>
+            <w:r>
+              <w:rPr>
+                <w:rFonts w:ascii="Times New Roman" w:hAnsi="Times New Roman"/>
+                <w:sz w:val="18"/>
+              </w:rPr>
+            </w:r>
+            <w:r>
+              <w:rPr>
+                <w:rFonts w:ascii="Times New Roman" w:hAnsi="Times New Roman"/>
+                <w:b w:val="0"/>
+                <w:sz w:val="18"/>
+              </w:rPr>
+              <w:t>A mayor longitud, mayor resistencia ante ataques de adivinación.</w:t>
+            </w:r>
+          </w:p>
+        </w:tc>
+      </w:tr>
+      <w:tr>
+        <w:tc>
+          <w:tcPr>
+            <w:tcW w:type="dxa" w:w="3120"/>
+            <w:vAlign w:val="center"/>
+          </w:tcPr>
+          <w:p>
+            <w:pPr>
+              <w:jc w:val="left"/>
+            </w:pPr>
+            <w:r>
+              <w:rPr>
+                <w:rFonts w:ascii="Times New Roman" w:hAnsi="Times New Roman"/>
+                <w:sz w:val="18"/>
+              </w:rPr>
+            </w:r>
+            <w:r>
+              <w:rPr>
+                <w:rFonts w:ascii="Times New Roman" w:hAnsi="Times New Roman"/>
+                <w:b w:val="0"/>
+                <w:sz w:val="18"/>
+              </w:rPr>
+              <w:t>Complejidad</w:t>
+            </w:r>
+          </w:p>
+        </w:tc>
+        <w:tc>
+          <w:tcPr>
+            <w:tcW w:type="dxa" w:w="3120"/>
+            <w:vAlign w:val="center"/>
+          </w:tcPr>
+          <w:p>
+            <w:pPr>
+              <w:jc w:val="left"/>
+            </w:pPr>
+            <w:r>
+              <w:rPr>
+                <w:rFonts w:ascii="Times New Roman" w:hAnsi="Times New Roman"/>
+                <w:sz w:val="18"/>
+              </w:rPr>
+            </w:r>
+            <w:r>
+              <w:rPr>
+                <w:rFonts w:ascii="Times New Roman" w:hAnsi="Times New Roman"/>
+                <w:b w:val="0"/>
+                <w:sz w:val="18"/>
+              </w:rPr>
+              <w:t>Combinar letras, números y símbolos</w:t>
+            </w:r>
+          </w:p>
+        </w:tc>
+        <w:tc>
+          <w:tcPr>
+            <w:tcW w:type="dxa" w:w="3120"/>
+            <w:vAlign w:val="center"/>
+          </w:tcPr>
+          <w:p>
+            <w:pPr>
+              <w:jc w:val="left"/>
+            </w:pPr>
+            <w:r>
+              <w:rPr>
+                <w:rFonts w:ascii="Times New Roman" w:hAnsi="Times New Roman"/>
+                <w:sz w:val="18"/>
+              </w:rPr>
+            </w:r>
+            <w:r>
+              <w:rPr>
+                <w:rFonts w:ascii="Times New Roman" w:hAnsi="Times New Roman"/>
+                <w:b w:val="0"/>
+                <w:sz w:val="18"/>
+              </w:rPr>
+              <w:t>Dificulta contraseñas demasiado simples o predecibles.</w:t>
+            </w:r>
+          </w:p>
+        </w:tc>
+      </w:tr>
+      <w:tr>
+        <w:tc>
+          <w:tcPr>
+            <w:tcW w:type="dxa" w:w="3120"/>
+            <w:vAlign w:val="center"/>
+          </w:tcPr>
+          <w:p>
+            <w:pPr>
+              <w:jc w:val="left"/>
+            </w:pPr>
+            <w:r>
+              <w:rPr>
+                <w:rFonts w:ascii="Times New Roman" w:hAnsi="Times New Roman"/>
+                <w:sz w:val="18"/>
+              </w:rPr>
+            </w:r>
+            <w:r>
+              <w:rPr>
+                <w:rFonts w:ascii="Times New Roman" w:hAnsi="Times New Roman"/>
+                <w:b w:val="0"/>
+                <w:sz w:val="18"/>
+              </w:rPr>
+              <w:t>Evitar datos personales</w:t>
+            </w:r>
+          </w:p>
+        </w:tc>
+        <w:tc>
+          <w:tcPr>
+            <w:tcW w:type="dxa" w:w="3120"/>
+            <w:vAlign w:val="center"/>
+          </w:tcPr>
+          <w:p>
+            <w:pPr>
+              <w:jc w:val="left"/>
+            </w:pPr>
+            <w:r>
+              <w:rPr>
+                <w:rFonts w:ascii="Times New Roman" w:hAnsi="Times New Roman"/>
+                <w:sz w:val="18"/>
+              </w:rPr>
+            </w:r>
+            <w:r>
+              <w:rPr>
+                <w:rFonts w:ascii="Times New Roman" w:hAnsi="Times New Roman"/>
+                <w:b w:val="0"/>
+                <w:sz w:val="18"/>
+              </w:rPr>
+              <w:t>No usar nombre, CI, fecha de nacimiento o teléfono</w:t>
+            </w:r>
+          </w:p>
+        </w:tc>
+        <w:tc>
+          <w:tcPr>
+            <w:tcW w:type="dxa" w:w="3120"/>
+            <w:vAlign w:val="center"/>
+          </w:tcPr>
+          <w:p>
+            <w:pPr>
+              <w:jc w:val="left"/>
+            </w:pPr>
+            <w:r>
+              <w:rPr>
+                <w:rFonts w:ascii="Times New Roman" w:hAnsi="Times New Roman"/>
+                <w:sz w:val="18"/>
+              </w:rPr>
+            </w:r>
+            <w:r>
+              <w:rPr>
+                <w:rFonts w:ascii="Times New Roman" w:hAnsi="Times New Roman"/>
+                <w:b w:val="0"/>
+                <w:sz w:val="18"/>
+              </w:rPr>
+              <w:t>Estos datos pueden ser conocidos por otras personas.</w:t>
+            </w:r>
+          </w:p>
+        </w:tc>
+      </w:tr>
+      <w:tr>
+        <w:tc>
+          <w:tcPr>
+            <w:tcW w:type="dxa" w:w="3120"/>
+            <w:vAlign w:val="center"/>
+          </w:tcPr>
+          <w:p>
+            <w:pPr>
+              <w:jc w:val="left"/>
+            </w:pPr>
+            <w:r>
+              <w:rPr>
+                <w:rFonts w:ascii="Times New Roman" w:hAnsi="Times New Roman"/>
+                <w:sz w:val="18"/>
+              </w:rPr>
+            </w:r>
+            <w:r>
+              <w:rPr>
+                <w:rFonts w:ascii="Times New Roman" w:hAnsi="Times New Roman"/>
+                <w:b w:val="0"/>
+                <w:sz w:val="18"/>
+              </w:rPr>
+              <w:t>Evitar contraseñas comunes</w:t>
+            </w:r>
+          </w:p>
+        </w:tc>
+        <w:tc>
+          <w:tcPr>
+            <w:tcW w:type="dxa" w:w="3120"/>
+            <w:vAlign w:val="center"/>
+          </w:tcPr>
+          <w:p>
+            <w:pPr>
+              <w:jc w:val="left"/>
+            </w:pPr>
+            <w:r>
+              <w:rPr>
+                <w:rFonts w:ascii="Times New Roman" w:hAnsi="Times New Roman"/>
+                <w:sz w:val="18"/>
+              </w:rPr>
+            </w:r>
+            <w:r>
+              <w:rPr>
+                <w:rFonts w:ascii="Times New Roman" w:hAnsi="Times New Roman"/>
+                <w:b w:val="0"/>
+                <w:sz w:val="18"/>
+              </w:rPr>
+              <w:t>No usar admin123, 123456, password, ventas123</w:t>
+            </w:r>
+          </w:p>
+        </w:tc>
+        <w:tc>
+          <w:tcPr>
+            <w:tcW w:type="dxa" w:w="3120"/>
+            <w:vAlign w:val="center"/>
+          </w:tcPr>
+          <w:p>
+            <w:pPr>
+              <w:jc w:val="left"/>
+            </w:pPr>
+            <w:r>
+              <w:rPr>
+                <w:rFonts w:ascii="Times New Roman" w:hAnsi="Times New Roman"/>
+                <w:sz w:val="18"/>
+              </w:rPr>
+            </w:r>
+            <w:r>
+              <w:rPr>
+                <w:rFonts w:ascii="Times New Roman" w:hAnsi="Times New Roman"/>
+                <w:b w:val="0"/>
+                <w:sz w:val="18"/>
+              </w:rPr>
+              <w:t>Son las primeras opciones probadas en ataques básicos.</w:t>
+            </w:r>
+          </w:p>
+        </w:tc>
+      </w:tr>
+      <w:tr>
+        <w:tc>
+          <w:tcPr>
+            <w:tcW w:type="dxa" w:w="3120"/>
+            <w:vAlign w:val="center"/>
+          </w:tcPr>
+          <w:p>
+            <w:pPr>
+              <w:jc w:val="left"/>
+            </w:pPr>
+            <w:r>
+              <w:rPr>
+                <w:rFonts w:ascii="Times New Roman" w:hAnsi="Times New Roman"/>
+                <w:sz w:val="18"/>
+              </w:rPr>
+            </w:r>
+            <w:r>
+              <w:rPr>
+                <w:rFonts w:ascii="Times New Roman" w:hAnsi="Times New Roman"/>
+                <w:b w:val="0"/>
+                <w:sz w:val="18"/>
+              </w:rPr>
+              <w:t>No reutilizar</w:t>
+            </w:r>
+          </w:p>
+        </w:tc>
+        <w:tc>
+          <w:tcPr>
+            <w:tcW w:type="dxa" w:w="3120"/>
+            <w:vAlign w:val="center"/>
+          </w:tcPr>
+          <w:p>
+            <w:pPr>
+              <w:jc w:val="left"/>
+            </w:pPr>
+            <w:r>
+              <w:rPr>
+                <w:rFonts w:ascii="Times New Roman" w:hAnsi="Times New Roman"/>
+                <w:sz w:val="18"/>
+              </w:rPr>
+            </w:r>
+            <w:r>
+              <w:rPr>
+                <w:rFonts w:ascii="Times New Roman" w:hAnsi="Times New Roman"/>
+                <w:b w:val="0"/>
+                <w:sz w:val="18"/>
+              </w:rPr>
+              <w:t>No repetir la misma contraseña en otros sistemas</w:t>
+            </w:r>
+          </w:p>
+        </w:tc>
+        <w:tc>
+          <w:tcPr>
+            <w:tcW w:type="dxa" w:w="3120"/>
+            <w:vAlign w:val="center"/>
+          </w:tcPr>
+          <w:p>
+            <w:pPr>
+              <w:jc w:val="left"/>
+            </w:pPr>
+            <w:r>
+              <w:rPr>
+                <w:rFonts w:ascii="Times New Roman" w:hAnsi="Times New Roman"/>
+                <w:sz w:val="18"/>
+              </w:rPr>
+            </w:r>
+            <w:r>
+              <w:rPr>
+                <w:rFonts w:ascii="Times New Roman" w:hAnsi="Times New Roman"/>
+                <w:b w:val="0"/>
+                <w:sz w:val="18"/>
+              </w:rPr>
+              <w:t>Evita que una filtración externa afecte este sistema.</w:t>
+            </w:r>
+          </w:p>
+        </w:tc>
+      </w:tr>
+    </w:tbl>
+    <w:p>
+      <w:pPr>
+        <w:pStyle w:val="Heading1"/>
+      </w:pPr>
+      <w:r>
+        <w:t>5. Controles técnicos recomendados</w:t>
+      </w:r>
+    </w:p>
+    <w:tbl>
+      <w:tblPr>
+        <w:tblStyle w:val="TableGrid"/>
+        <w:tblW w:type="auto" w:w="0"/>
+        <w:jc w:val="center"/>
+        <w:tblLook w:firstColumn="1" w:firstRow="1" w:lastColumn="0" w:lastRow="0" w:noHBand="0" w:noVBand="1" w:val="04A0"/>
+      </w:tblPr>
+      <w:tblGrid>
+        <w:gridCol w:w="4680"/>
+        <w:gridCol w:w="4680"/>
+      </w:tblGrid>
+      <w:tr>
+        <w:trPr>
+          <w:tblHeader w:val="true"/>
+        </w:trPr>
+        <w:tc>
+          <w:tcPr>
+            <w:tcW w:type="dxa" w:w="4680"/>
+            <w:vAlign w:val="center"/>
+            <w:shd w:fill="E8EEF5"/>
+          </w:tcPr>
+          <w:p>
+            <w:pPr>
+              <w:jc w:val="left"/>
+            </w:pPr>
+            <w:r>
+              <w:rPr>
+                <w:rFonts w:ascii="Times New Roman" w:hAnsi="Times New Roman"/>
+                <w:b/>
+                <w:sz w:val="18"/>
+              </w:rPr>
+            </w:r>
+            <w:r>
+              <w:rPr>
+                <w:rFonts w:ascii="Times New Roman" w:hAnsi="Times New Roman"/>
+                <w:b/>
+                <w:sz w:val="18"/>
+              </w:rPr>
+              <w:t>Control</w:t>
+            </w:r>
+          </w:p>
+        </w:tc>
+        <w:tc>
+          <w:tcPr>
+            <w:tcW w:type="dxa" w:w="4680"/>
+            <w:vAlign w:val="center"/>
+            <w:shd w:fill="E8EEF5"/>
+          </w:tcPr>
+          <w:p>
+            <w:pPr>
+              <w:jc w:val="left"/>
+            </w:pPr>
+            <w:r>
+              <w:rPr>
+                <w:rFonts w:ascii="Times New Roman" w:hAnsi="Times New Roman"/>
+                <w:b/>
+                <w:sz w:val="18"/>
+              </w:rPr>
+            </w:r>
+            <w:r>
+              <w:rPr>
+                <w:rFonts w:ascii="Times New Roman" w:hAnsi="Times New Roman"/>
+                <w:b/>
+                <w:sz w:val="18"/>
+              </w:rPr>
+              <w:t>Aplicación</w:t>
+            </w:r>
+          </w:p>
+        </w:tc>
+      </w:tr>
+      <w:tr>
+        <w:tc>
+          <w:tcPr>
+            <w:tcW w:type="dxa" w:w="4680"/>
+            <w:vAlign w:val="center"/>
+          </w:tcPr>
+          <w:p>
+            <w:pPr>
+              <w:jc w:val="left"/>
+            </w:pPr>
+            <w:r>
+              <w:rPr>
+                <w:rFonts w:ascii="Times New Roman" w:hAnsi="Times New Roman"/>
+                <w:sz w:val="18"/>
+              </w:rPr>
+            </w:r>
+            <w:r>
+              <w:rPr>
+                <w:rFonts w:ascii="Times New Roman" w:hAnsi="Times New Roman"/>
+                <w:b w:val="0"/>
+                <w:sz w:val="18"/>
+              </w:rPr>
+              <w:t>Hash de contraseñas</w:t>
+            </w:r>
+          </w:p>
+        </w:tc>
+        <w:tc>
+          <w:tcPr>
+            <w:tcW w:type="dxa" w:w="4680"/>
+            <w:vAlign w:val="center"/>
+          </w:tcPr>
+          <w:p>
+            <w:pPr>
+              <w:jc w:val="left"/>
+            </w:pPr>
+            <w:r>
+              <w:rPr>
+                <w:rFonts w:ascii="Times New Roman" w:hAnsi="Times New Roman"/>
+                <w:sz w:val="18"/>
+              </w:rPr>
+            </w:r>
+            <w:r>
+              <w:rPr>
+                <w:rFonts w:ascii="Times New Roman" w:hAnsi="Times New Roman"/>
+                <w:b w:val="0"/>
+                <w:sz w:val="18"/>
+              </w:rPr>
+              <w:t>Guardar contraseñas con bcrypt o argon2, nunca en texto plano.</w:t>
+            </w:r>
+          </w:p>
+        </w:tc>
+      </w:tr>
+      <w:tr>
+        <w:tc>
+          <w:tcPr>
+            <w:tcW w:type="dxa" w:w="4680"/>
+            <w:vAlign w:val="center"/>
+          </w:tcPr>
+          <w:p>
+            <w:pPr>
+              <w:jc w:val="left"/>
+            </w:pPr>
+            <w:r>
+              <w:rPr>
+                <w:rFonts w:ascii="Times New Roman" w:hAnsi="Times New Roman"/>
+                <w:sz w:val="18"/>
+              </w:rPr>
+            </w:r>
+            <w:r>
+              <w:rPr>
+                <w:rFonts w:ascii="Times New Roman" w:hAnsi="Times New Roman"/>
+                <w:b w:val="0"/>
+                <w:sz w:val="18"/>
+              </w:rPr>
+              <w:t>Bloqueo por intentos fallidos</w:t>
+            </w:r>
+          </w:p>
+        </w:tc>
+        <w:tc>
+          <w:tcPr>
+            <w:tcW w:type="dxa" w:w="4680"/>
+            <w:vAlign w:val="center"/>
+          </w:tcPr>
+          <w:p>
+            <w:pPr>
+              <w:jc w:val="left"/>
+            </w:pPr>
+            <w:r>
+              <w:rPr>
+                <w:rFonts w:ascii="Times New Roman" w:hAnsi="Times New Roman"/>
+                <w:sz w:val="18"/>
+              </w:rPr>
+            </w:r>
+            <w:r>
+              <w:rPr>
+                <w:rFonts w:ascii="Times New Roman" w:hAnsi="Times New Roman"/>
+                <w:b w:val="0"/>
+                <w:sz w:val="18"/>
+              </w:rPr>
+              <w:t>Bloquear temporalmente la cuenta después de 5 intentos fallidos.</w:t>
+            </w:r>
+          </w:p>
+        </w:tc>
+      </w:tr>
+      <w:tr>
+        <w:tc>
+          <w:tcPr>
+            <w:tcW w:type="dxa" w:w="4680"/>
+            <w:vAlign w:val="center"/>
+          </w:tcPr>
+          <w:p>
+            <w:pPr>
+              <w:jc w:val="left"/>
+            </w:pPr>
+            <w:r>
+              <w:rPr>
+                <w:rFonts w:ascii="Times New Roman" w:hAnsi="Times New Roman"/>
+                <w:sz w:val="18"/>
+              </w:rPr>
+            </w:r>
+            <w:r>
+              <w:rPr>
+                <w:rFonts w:ascii="Times New Roman" w:hAnsi="Times New Roman"/>
+                <w:b w:val="0"/>
+                <w:sz w:val="18"/>
+              </w:rPr>
+              <w:t>Mensajes de error discretos</w:t>
+            </w:r>
+          </w:p>
+        </w:tc>
+        <w:tc>
+          <w:tcPr>
+            <w:tcW w:type="dxa" w:w="4680"/>
+            <w:vAlign w:val="center"/>
+          </w:tcPr>
+          <w:p>
+            <w:pPr>
+              <w:jc w:val="left"/>
+            </w:pPr>
+            <w:r>
+              <w:rPr>
+                <w:rFonts w:ascii="Times New Roman" w:hAnsi="Times New Roman"/>
+                <w:sz w:val="18"/>
+              </w:rPr>
+            </w:r>
+            <w:r>
+              <w:rPr>
+                <w:rFonts w:ascii="Times New Roman" w:hAnsi="Times New Roman"/>
+                <w:b w:val="0"/>
+                <w:sz w:val="18"/>
+              </w:rPr>
+              <w:t>No indicar si falló el usuario o la contraseña; solo mostrar credenciales incorrectas.</w:t>
+            </w:r>
+          </w:p>
+        </w:tc>
+      </w:tr>
+      <w:tr>
+        <w:tc>
+          <w:tcPr>
+            <w:tcW w:type="dxa" w:w="4680"/>
+            <w:vAlign w:val="center"/>
+          </w:tcPr>
+          <w:p>
+            <w:pPr>
+              <w:jc w:val="left"/>
+            </w:pPr>
+            <w:r>
+              <w:rPr>
+                <w:rFonts w:ascii="Times New Roman" w:hAnsi="Times New Roman"/>
+                <w:sz w:val="18"/>
+              </w:rPr>
+            </w:r>
+            <w:r>
+              <w:rPr>
+                <w:rFonts w:ascii="Times New Roman" w:hAnsi="Times New Roman"/>
+                <w:b w:val="0"/>
+                <w:sz w:val="18"/>
+              </w:rPr>
+              <w:t>Recuperación segura</w:t>
+            </w:r>
+          </w:p>
+        </w:tc>
+        <w:tc>
+          <w:tcPr>
+            <w:tcW w:type="dxa" w:w="4680"/>
+            <w:vAlign w:val="center"/>
+          </w:tcPr>
+          <w:p>
+            <w:pPr>
+              <w:jc w:val="left"/>
+            </w:pPr>
+            <w:r>
+              <w:rPr>
+                <w:rFonts w:ascii="Times New Roman" w:hAnsi="Times New Roman"/>
+                <w:sz w:val="18"/>
+              </w:rPr>
+            </w:r>
+            <w:r>
+              <w:rPr>
+                <w:rFonts w:ascii="Times New Roman" w:hAnsi="Times New Roman"/>
+                <w:b w:val="0"/>
+                <w:sz w:val="18"/>
+              </w:rPr>
+              <w:t>Restablecer contraseñas mediante un proceso controlado, no mostrando la contraseña actual.</w:t>
+            </w:r>
+          </w:p>
+        </w:tc>
+      </w:tr>
+      <w:tr>
+        <w:tc>
+          <w:tcPr>
+            <w:tcW w:type="dxa" w:w="4680"/>
+            <w:vAlign w:val="center"/>
+          </w:tcPr>
+          <w:p>
+            <w:pPr>
+              <w:jc w:val="left"/>
+            </w:pPr>
+            <w:r>
+              <w:rPr>
+                <w:rFonts w:ascii="Times New Roman" w:hAnsi="Times New Roman"/>
+                <w:sz w:val="18"/>
+              </w:rPr>
+            </w:r>
+            <w:r>
+              <w:rPr>
+                <w:rFonts w:ascii="Times New Roman" w:hAnsi="Times New Roman"/>
+                <w:b w:val="0"/>
+                <w:sz w:val="18"/>
+              </w:rPr>
+              <w:t>Registro de eventos</w:t>
+            </w:r>
+          </w:p>
+        </w:tc>
+        <w:tc>
+          <w:tcPr>
+            <w:tcW w:type="dxa" w:w="4680"/>
+            <w:vAlign w:val="center"/>
+          </w:tcPr>
+          <w:p>
+            <w:pPr>
+              <w:jc w:val="left"/>
+            </w:pPr>
+            <w:r>
+              <w:rPr>
+                <w:rFonts w:ascii="Times New Roman" w:hAnsi="Times New Roman"/>
+                <w:sz w:val="18"/>
+              </w:rPr>
+            </w:r>
+            <w:r>
+              <w:rPr>
+                <w:rFonts w:ascii="Times New Roman" w:hAnsi="Times New Roman"/>
+                <w:b w:val="0"/>
+                <w:sz w:val="18"/>
+              </w:rPr>
+              <w:t>Registrar intentos fallidos, cambios de contraseña y accesos administrativos.</w:t>
+            </w:r>
+          </w:p>
+        </w:tc>
+      </w:tr>
+      <w:tr>
+        <w:tc>
+          <w:tcPr>
+            <w:tcW w:type="dxa" w:w="4680"/>
+            <w:vAlign w:val="center"/>
+          </w:tcPr>
+          <w:p>
+            <w:pPr>
+              <w:jc w:val="left"/>
+            </w:pPr>
+            <w:r>
+              <w:rPr>
+                <w:rFonts w:ascii="Times New Roman" w:hAnsi="Times New Roman"/>
+                <w:sz w:val="18"/>
+              </w:rPr>
+            </w:r>
+            <w:r>
+              <w:rPr>
+                <w:rFonts w:ascii="Times New Roman" w:hAnsi="Times New Roman"/>
+                <w:b w:val="0"/>
+                <w:sz w:val="18"/>
+              </w:rPr>
+              <w:t>Sesiónes seguras</w:t>
+            </w:r>
+          </w:p>
+        </w:tc>
+        <w:tc>
+          <w:tcPr>
+            <w:tcW w:type="dxa" w:w="4680"/>
+            <w:vAlign w:val="center"/>
+          </w:tcPr>
+          <w:p>
+            <w:pPr>
+              <w:jc w:val="left"/>
+            </w:pPr>
+            <w:r>
+              <w:rPr>
+                <w:rFonts w:ascii="Times New Roman" w:hAnsi="Times New Roman"/>
+                <w:sz w:val="18"/>
+              </w:rPr>
+            </w:r>
+            <w:r>
+              <w:rPr>
+                <w:rFonts w:ascii="Times New Roman" w:hAnsi="Times New Roman"/>
+                <w:b w:val="0"/>
+                <w:sz w:val="18"/>
+              </w:rPr>
+              <w:t>Configurar cookies HttpOnly, SameSite y Secure cuando se use HTTPS.</w:t>
+            </w:r>
+          </w:p>
+        </w:tc>
+      </w:tr>
+    </w:tbl>
+    <w:p>
+      <w:pPr>
+        <w:pStyle w:val="Heading1"/>
+      </w:pPr>
+      <w:r>
+        <w:t>6. Responsabilidades</w:t>
       </w:r>
     </w:p>
     <w:p>
@@ -256,7 +1139,7 @@
           <w:rFonts w:ascii="Times New Roman" w:hAnsi="Times New Roman"/>
           <w:sz w:val="24"/>
         </w:rPr>
-        <w:t>La longitud minima recomendada para usuarios del sistema sera de 10 caracteres.</w:t>
+        <w:t>Usuario: mantener en reserva sus credenciales y cerrar sesión al finalizar.</w:t>
       </w:r>
     </w:p>
     <w:p>
@@ -268,7 +1151,7 @@
           <w:rFonts w:ascii="Times New Roman" w:hAnsi="Times New Roman"/>
           <w:sz w:val="24"/>
         </w:rPr>
-        <w:t>La contrasena debe combinar letras mayusculas, minusculas, numeros y caracteres especiales.</w:t>
+        <w:t>Administrador: crear cuentas, revocar accesos, revisar intentos fallidos y proteger el servidor.</w:t>
       </w:r>
     </w:p>
     <w:p>
@@ -280,7 +1163,7 @@
           <w:rFonts w:ascii="Times New Roman" w:hAnsi="Times New Roman"/>
           <w:sz w:val="24"/>
         </w:rPr>
-        <w:t>No se permite usar contraseñas comunes como admin123, ventas123, password, 123456 o datos personales.</w:t>
+        <w:t>Desarrollador: implementar hash, válidaciónes y controles de sesión.</w:t>
       </w:r>
     </w:p>
     <w:p>
@@ -292,31 +1175,7 @@
           <w:rFonts w:ascii="Times New Roman" w:hAnsi="Times New Roman"/>
           <w:sz w:val="24"/>
         </w:rPr>
-        <w:t>Las contraseñas no deben compartirse por mensajeria, correo o documentos sin proteccion.</w:t>
-      </w:r>
-    </w:p>
-    <w:p>
-      <w:pPr>
-        <w:pStyle w:val="ListBullet"/>
-      </w:pPr>
-      <w:r>
-        <w:rPr>
-          <w:rFonts w:ascii="Times New Roman" w:hAnsi="Times New Roman"/>
-          <w:sz w:val="24"/>
-        </w:rPr>
-        <w:t>El sistema debe bloquear temporalmente la cuenta después de 5 intentos fallidos.</w:t>
-      </w:r>
-    </w:p>
-    <w:p>
-      <w:pPr>
-        <w:pStyle w:val="ListBullet"/>
-      </w:pPr>
-      <w:r>
-        <w:rPr>
-          <w:rFonts w:ascii="Times New Roman" w:hAnsi="Times New Roman"/>
-          <w:sz w:val="24"/>
-        </w:rPr>
-        <w:t>La recuperacion de contrasena debe realizarse mediante un procedimiento controlado y registrado.</w:t>
+        <w:t>Equipo auditor: verificar que las reglas propuestas mitiguen los riesgos encontrados.</w:t>
       </w:r>
     </w:p>
     <w:p>
@@ -324,7 +1183,7 @@
         <w:pStyle w:val="Heading1"/>
       </w:pPr>
       <w:r>
-        <w:t>Almacenamiento seguro</w:t>
+        <w:t>7. Excepción para el laboratorio</w:t>
       </w:r>
     </w:p>
     <w:p>
@@ -336,7 +1195,7 @@
           <w:rFonts w:ascii="Times New Roman" w:hAnsi="Times New Roman"/>
           <w:sz w:val="24"/>
         </w:rPr>
-        <w:t>Las contraseñas no deben almacenarse en texto plano. El sistema debe aplicar algoritmos de hash seguros como bcrypt o argon2, con sal unica por usuario. La base de datos no debe contener secretos directamente legibles.</w:t>
+        <w:t>Durante la auditoría se permiten credenciales débiles documentadas para demostrar el riesgo. Esta excepción solo aplica dentro del laboratorio de VirtualBox y durante la presentación. Al finalizar, el servicio debe detenerse o la máquina virtual debe apagarse.</w:t>
       </w:r>
     </w:p>
     <w:p>
@@ -344,75 +1203,7 @@
         <w:pStyle w:val="Heading1"/>
       </w:pPr>
       <w:r>
-        <w:t>Política para el servidor Fedora</w:t>
-      </w:r>
-    </w:p>
-    <w:p>
-      <w:pPr>
-        <w:pStyle w:val="ListBullet"/>
-      </w:pPr>
-      <w:r>
-        <w:rPr>
-          <w:rFonts w:ascii="Times New Roman" w:hAnsi="Times New Roman"/>
-          <w:sz w:val="24"/>
-        </w:rPr>
-        <w:t>Usar cuentas individuales para administracion.</w:t>
-      </w:r>
-    </w:p>
-    <w:p>
-      <w:pPr>
-        <w:pStyle w:val="ListBullet"/>
-      </w:pPr>
-      <w:r>
-        <w:rPr>
-          <w:rFonts w:ascii="Times New Roman" w:hAnsi="Times New Roman"/>
-          <w:sz w:val="24"/>
-        </w:rPr>
-        <w:t>Evitar el uso de root para tareas comunes.</w:t>
-      </w:r>
-    </w:p>
-    <w:p>
-      <w:pPr>
-        <w:pStyle w:val="ListBullet"/>
-      </w:pPr>
-      <w:r>
-        <w:rPr>
-          <w:rFonts w:ascii="Times New Roman" w:hAnsi="Times New Roman"/>
-          <w:sz w:val="24"/>
-        </w:rPr>
-        <w:t>Proteger el acceso SSH si se habilita durante la practica.</w:t>
-      </w:r>
-    </w:p>
-    <w:p>
-      <w:pPr>
-        <w:pStyle w:val="ListBullet"/>
-      </w:pPr>
-      <w:r>
-        <w:rPr>
-          <w:rFonts w:ascii="Times New Roman" w:hAnsi="Times New Roman"/>
-          <w:sz w:val="24"/>
-        </w:rPr>
-        <w:t>Cerrar el puerto 5000 al finalizar la demostracion.</w:t>
-      </w:r>
-    </w:p>
-    <w:p>
-      <w:pPr>
-        <w:pStyle w:val="ListBullet"/>
-      </w:pPr>
-      <w:r>
-        <w:rPr>
-          <w:rFonts w:ascii="Times New Roman" w:hAnsi="Times New Roman"/>
-          <w:sz w:val="24"/>
-        </w:rPr>
-        <w:t>Registrar cambios relevantes en el servidor y en el repositorio GitHub.</w:t>
-      </w:r>
-    </w:p>
-    <w:p>
-      <w:pPr>
-        <w:pStyle w:val="Heading1"/>
-      </w:pPr>
-      <w:r>
-        <w:t>Excepciones</w:t>
+        <w:t>8. Conclusión</w:t>
       </w:r>
     </w:p>
     <w:p>
@@ -424,7 +1215,7 @@
           <w:rFonts w:ascii="Times New Roman" w:hAnsi="Times New Roman"/>
           <w:sz w:val="24"/>
         </w:rPr>
-        <w:t>Durante el laboratorio académico se permiten credenciales débiles documentadas, como admin/admin123, únicamente para demostrar vulnerabilidades y justificar controles. Estas credenciales no deben utilizarse en entornos reales.</w:t>
+        <w:t>Una política de contraseñas no solo define cómo debe escribir una clave el usuario; también obliga al sistema a protegerla correctamente. En este proyecto se evidenció que una contraseña débil y almacenada en texto plano puede comprometer por completo el acceso al sistema. Por ello, antes de usar una aplicación similar en un entorno real, se deben aplicar controles de longitud, bloqueo, registro de eventos y almacenamiento seguro con hash.</w:t>
       </w:r>
     </w:p>
     <w:p>
@@ -432,47 +1223,7 @@
         <w:pStyle w:val="Heading1"/>
       </w:pPr>
       <w:r>
-        <w:t>Sanciones o medidas correctivas</w:t>
-      </w:r>
-    </w:p>
-    <w:p>
-      <w:pPr>
-        <w:jc w:val="both"/>
-      </w:pPr>
-      <w:r>
-        <w:rPr>
-          <w:rFonts w:ascii="Times New Roman" w:hAnsi="Times New Roman"/>
-          <w:sz w:val="24"/>
-        </w:rPr>
-        <w:t>El incumplimiento de esta política debe corregirse mediante cambio inmediato de contrasena, revocacion temporal de acceso, revision de logs y actualizacion del control vulnerado.</w:t>
-      </w:r>
-    </w:p>
-    <w:p>
-      <w:pPr>
-        <w:pStyle w:val="Heading1"/>
-      </w:pPr>
-      <w:r>
-        <w:t>Conclusiones</w:t>
-      </w:r>
-    </w:p>
-    <w:p>
-      <w:pPr>
-        <w:jc w:val="both"/>
-      </w:pPr>
-      <w:r>
-        <w:rPr>
-          <w:rFonts w:ascii="Times New Roman" w:hAnsi="Times New Roman"/>
-          <w:sz w:val="24"/>
-        </w:rPr>
-        <w:t>Una política de contraseñas reduce el riesgo de accesos no autorizados y fortalece la autenticación. Para que sea efectiva, debe complementarse con implementacion técnica, monitoreo y capacitacion de usuarios.</w:t>
-      </w:r>
-    </w:p>
-    <w:p>
-      <w:pPr>
-        <w:pStyle w:val="Heading1"/>
-      </w:pPr>
-      <w:r>
-        <w:t>Bibliografia</w:t>
+        <w:t>Bibliografía</w:t>
       </w:r>
     </w:p>
     <w:p>

</xml_diff>